<commit_message>
docs(korail): publish monochrome questionnaire and A4 PDF
Refs #14
</commit_message>
<xml_diff>
--- a/docs/korail/CHOOGuard_KORAIL_개발질의서_A4_1p.docx
+++ b/docs/korail/CHOOGuard_KORAIL_개발질의서_A4_1p.docx
@@ -10,9 +10,9 @@
       </w:pPr>
       <w:r>
         <w:rPr>
-          <w:rFonts w:ascii="Arial" w:hAnsi="Arial" w:eastAsia="맑은 고딕"/>
+          <w:rFonts w:ascii="Times New Roman" w:hAnsi="Times New Roman" w:eastAsia="바탕"/>
           <w:b/>
-          <w:color w:val="17365D"/>
+          <w:color w:val="000000"/>
           <w:sz w:val="34"/>
           <w:lang w:val="ko-KR" w:eastAsia="ko-KR"/>
         </w:rPr>
@@ -27,9 +27,9 @@
       </w:pPr>
       <w:r>
         <w:rPr>
-          <w:rFonts w:ascii="Arial" w:hAnsi="Arial" w:eastAsia="맑은 고딕"/>
+          <w:rFonts w:ascii="Times New Roman" w:hAnsi="Times New Roman" w:eastAsia="바탕"/>
           <w:b w:val="0"/>
-          <w:color w:val="555555"/>
+          <w:color w:val="000000"/>
           <w:sz w:val="18"/>
           <w:lang w:val="ko-KR" w:eastAsia="ko-KR"/>
         </w:rPr>
@@ -43,9 +43,9 @@
       </w:pPr>
       <w:r>
         <w:rPr>
-          <w:rFonts w:ascii="Arial" w:hAnsi="Arial" w:eastAsia="맑은 고딕"/>
+          <w:rFonts w:ascii="Times New Roman" w:hAnsi="Times New Roman" w:eastAsia="바탕"/>
           <w:b w:val="0"/>
-          <w:color w:val="111111"/>
+          <w:color w:val="000000"/>
           <w:sz w:val="22"/>
           <w:lang w:val="ko-KR" w:eastAsia="ko-KR"/>
         </w:rPr>
@@ -60,9 +60,9 @@
       </w:pPr>
       <w:r>
         <w:rPr>
-          <w:rFonts w:ascii="Arial" w:hAnsi="Arial" w:eastAsia="맑은 고딕"/>
+          <w:rFonts w:ascii="Times New Roman" w:hAnsi="Times New Roman" w:eastAsia="바탕"/>
           <w:b/>
-          <w:color w:val="17365D"/>
+          <w:color w:val="000000"/>
           <w:sz w:val="24"/>
           <w:lang w:val="ko-KR" w:eastAsia="ko-KR"/>
         </w:rPr>
@@ -70,9 +70,9 @@
       </w:r>
       <w:r>
         <w:rPr>
-          <w:rFonts w:ascii="Arial" w:hAnsi="Arial" w:eastAsia="맑은 고딕"/>
+          <w:rFonts w:ascii="Times New Roman" w:hAnsi="Times New Roman" w:eastAsia="바탕"/>
           <w:b w:val="0"/>
-          <w:color w:val="111111"/>
+          <w:color w:val="000000"/>
           <w:sz w:val="24"/>
           <w:lang w:val="ko-KR" w:eastAsia="ko-KR"/>
         </w:rPr>
@@ -87,9 +87,9 @@
       </w:pPr>
       <w:r>
         <w:rPr>
-          <w:rFonts w:ascii="Arial" w:hAnsi="Arial" w:eastAsia="맑은 고딕"/>
+          <w:rFonts w:ascii="Times New Roman" w:hAnsi="Times New Roman" w:eastAsia="바탕"/>
           <w:b/>
-          <w:color w:val="17365D"/>
+          <w:color w:val="000000"/>
           <w:sz w:val="24"/>
           <w:lang w:val="ko-KR" w:eastAsia="ko-KR"/>
         </w:rPr>
@@ -97,9 +97,9 @@
       </w:r>
       <w:r>
         <w:rPr>
-          <w:rFonts w:ascii="Arial" w:hAnsi="Arial" w:eastAsia="맑은 고딕"/>
+          <w:rFonts w:ascii="Times New Roman" w:hAnsi="Times New Roman" w:eastAsia="바탕"/>
           <w:b w:val="0"/>
-          <w:color w:val="111111"/>
+          <w:color w:val="000000"/>
           <w:sz w:val="24"/>
           <w:lang w:val="ko-KR" w:eastAsia="ko-KR"/>
         </w:rPr>
@@ -114,9 +114,9 @@
       </w:pPr>
       <w:r>
         <w:rPr>
-          <w:rFonts w:ascii="Arial" w:hAnsi="Arial" w:eastAsia="맑은 고딕"/>
+          <w:rFonts w:ascii="Times New Roman" w:hAnsi="Times New Roman" w:eastAsia="바탕"/>
           <w:b/>
-          <w:color w:val="17365D"/>
+          <w:color w:val="000000"/>
           <w:sz w:val="24"/>
           <w:lang w:val="ko-KR" w:eastAsia="ko-KR"/>
         </w:rPr>
@@ -124,9 +124,9 @@
       </w:r>
       <w:r>
         <w:rPr>
-          <w:rFonts w:ascii="Arial" w:hAnsi="Arial" w:eastAsia="맑은 고딕"/>
+          <w:rFonts w:ascii="Times New Roman" w:hAnsi="Times New Roman" w:eastAsia="바탕"/>
           <w:b w:val="0"/>
-          <w:color w:val="111111"/>
+          <w:color w:val="000000"/>
           <w:sz w:val="24"/>
           <w:lang w:val="ko-KR" w:eastAsia="ko-KR"/>
         </w:rPr>
@@ -141,9 +141,9 @@
       </w:pPr>
       <w:r>
         <w:rPr>
-          <w:rFonts w:ascii="Arial" w:hAnsi="Arial" w:eastAsia="맑은 고딕"/>
+          <w:rFonts w:ascii="Times New Roman" w:hAnsi="Times New Roman" w:eastAsia="바탕"/>
           <w:b/>
-          <w:color w:val="17365D"/>
+          <w:color w:val="000000"/>
           <w:sz w:val="24"/>
           <w:lang w:val="ko-KR" w:eastAsia="ko-KR"/>
         </w:rPr>
@@ -151,9 +151,9 @@
       </w:r>
       <w:r>
         <w:rPr>
-          <w:rFonts w:ascii="Arial" w:hAnsi="Arial" w:eastAsia="맑은 고딕"/>
+          <w:rFonts w:ascii="Times New Roman" w:hAnsi="Times New Roman" w:eastAsia="바탕"/>
           <w:b w:val="0"/>
-          <w:color w:val="111111"/>
+          <w:color w:val="000000"/>
           <w:sz w:val="24"/>
           <w:lang w:val="ko-KR" w:eastAsia="ko-KR"/>
         </w:rPr>
@@ -168,9 +168,9 @@
       </w:pPr>
       <w:r>
         <w:rPr>
-          <w:rFonts w:ascii="Arial" w:hAnsi="Arial" w:eastAsia="맑은 고딕"/>
+          <w:rFonts w:ascii="Times New Roman" w:hAnsi="Times New Roman" w:eastAsia="바탕"/>
           <w:b/>
-          <w:color w:val="17365D"/>
+          <w:color w:val="000000"/>
           <w:sz w:val="24"/>
           <w:lang w:val="ko-KR" w:eastAsia="ko-KR"/>
         </w:rPr>
@@ -178,9 +178,9 @@
       </w:r>
       <w:r>
         <w:rPr>
-          <w:rFonts w:ascii="Arial" w:hAnsi="Arial" w:eastAsia="맑은 고딕"/>
+          <w:rFonts w:ascii="Times New Roman" w:hAnsi="Times New Roman" w:eastAsia="바탕"/>
           <w:b w:val="0"/>
-          <w:color w:val="111111"/>
+          <w:color w:val="000000"/>
           <w:sz w:val="24"/>
           <w:lang w:val="ko-KR" w:eastAsia="ko-KR"/>
         </w:rPr>
@@ -195,9 +195,9 @@
       </w:pPr>
       <w:r>
         <w:rPr>
-          <w:rFonts w:ascii="Arial" w:hAnsi="Arial" w:eastAsia="맑은 고딕"/>
+          <w:rFonts w:ascii="Times New Roman" w:hAnsi="Times New Roman" w:eastAsia="바탕"/>
           <w:b/>
-          <w:color w:val="17365D"/>
+          <w:color w:val="000000"/>
           <w:sz w:val="24"/>
           <w:lang w:val="ko-KR" w:eastAsia="ko-KR"/>
         </w:rPr>
@@ -205,9 +205,9 @@
       </w:r>
       <w:r>
         <w:rPr>
-          <w:rFonts w:ascii="Arial" w:hAnsi="Arial" w:eastAsia="맑은 고딕"/>
+          <w:rFonts w:ascii="Times New Roman" w:hAnsi="Times New Roman" w:eastAsia="바탕"/>
           <w:b w:val="0"/>
-          <w:color w:val="111111"/>
+          <w:color w:val="000000"/>
           <w:sz w:val="24"/>
           <w:lang w:val="ko-KR" w:eastAsia="ko-KR"/>
         </w:rPr>
@@ -222,9 +222,9 @@
       </w:pPr>
       <w:r>
         <w:rPr>
-          <w:rFonts w:ascii="Arial" w:hAnsi="Arial" w:eastAsia="맑은 고딕"/>
+          <w:rFonts w:ascii="Times New Roman" w:hAnsi="Times New Roman" w:eastAsia="바탕"/>
           <w:b/>
-          <w:color w:val="17365D"/>
+          <w:color w:val="000000"/>
           <w:sz w:val="24"/>
           <w:lang w:val="ko-KR" w:eastAsia="ko-KR"/>
         </w:rPr>
@@ -232,9 +232,9 @@
       </w:r>
       <w:r>
         <w:rPr>
-          <w:rFonts w:ascii="Arial" w:hAnsi="Arial" w:eastAsia="맑은 고딕"/>
+          <w:rFonts w:ascii="Times New Roman" w:hAnsi="Times New Roman" w:eastAsia="바탕"/>
           <w:b w:val="0"/>
-          <w:color w:val="111111"/>
+          <w:color w:val="000000"/>
           <w:sz w:val="24"/>
           <w:lang w:val="ko-KR" w:eastAsia="ko-KR"/>
         </w:rPr>
@@ -249,9 +249,9 @@
       </w:pPr>
       <w:r>
         <w:rPr>
-          <w:rFonts w:ascii="Arial" w:hAnsi="Arial" w:eastAsia="맑은 고딕"/>
+          <w:rFonts w:ascii="Times New Roman" w:hAnsi="Times New Roman" w:eastAsia="바탕"/>
           <w:b/>
-          <w:color w:val="17365D"/>
+          <w:color w:val="000000"/>
           <w:sz w:val="24"/>
           <w:lang w:val="ko-KR" w:eastAsia="ko-KR"/>
         </w:rPr>
@@ -259,9 +259,9 @@
       </w:r>
       <w:r>
         <w:rPr>
-          <w:rFonts w:ascii="Arial" w:hAnsi="Arial" w:eastAsia="맑은 고딕"/>
+          <w:rFonts w:ascii="Times New Roman" w:hAnsi="Times New Roman" w:eastAsia="바탕"/>
           <w:b w:val="0"/>
-          <w:color w:val="111111"/>
+          <w:color w:val="000000"/>
           <w:sz w:val="24"/>
           <w:lang w:val="ko-KR" w:eastAsia="ko-KR"/>
         </w:rPr>
@@ -276,9 +276,9 @@
       </w:pPr>
       <w:r>
         <w:rPr>
-          <w:rFonts w:ascii="Arial" w:hAnsi="Arial" w:eastAsia="맑은 고딕"/>
+          <w:rFonts w:ascii="Times New Roman" w:hAnsi="Times New Roman" w:eastAsia="바탕"/>
           <w:b/>
-          <w:color w:val="17365D"/>
+          <w:color w:val="000000"/>
           <w:sz w:val="24"/>
           <w:lang w:val="ko-KR" w:eastAsia="ko-KR"/>
         </w:rPr>
@@ -286,9 +286,9 @@
       </w:r>
       <w:r>
         <w:rPr>
-          <w:rFonts w:ascii="Arial" w:hAnsi="Arial" w:eastAsia="맑은 고딕"/>
+          <w:rFonts w:ascii="Times New Roman" w:hAnsi="Times New Roman" w:eastAsia="바탕"/>
           <w:b w:val="0"/>
-          <w:color w:val="111111"/>
+          <w:color w:val="000000"/>
           <w:sz w:val="24"/>
           <w:lang w:val="ko-KR" w:eastAsia="ko-KR"/>
         </w:rPr>
@@ -302,9 +302,9 @@
       </w:pPr>
       <w:r>
         <w:rPr>
-          <w:rFonts w:ascii="Arial" w:hAnsi="Arial" w:eastAsia="맑은 고딕"/>
+          <w:rFonts w:ascii="Times New Roman" w:hAnsi="Times New Roman" w:eastAsia="바탕"/>
           <w:b w:val="0"/>
-          <w:color w:val="444444"/>
+          <w:color w:val="000000"/>
           <w:sz w:val="19"/>
           <w:lang w:val="ko-KR" w:eastAsia="ko-KR"/>
         </w:rPr>
@@ -688,7 +688,8 @@
       <w:spacing w:lineRule="exact" w:line="330" w:after="90"/>
     </w:pPr>
     <w:rPr>
-      <w:rFonts w:ascii="Arial" w:hAnsi="Arial" w:eastAsia="맑은 고딕"/>
+      <w:rFonts w:ascii="Times New Roman" w:hAnsi="Times New Roman" w:eastAsia="바탕"/>
+      <w:color w:val="000000"/>
       <w:sz w:val="24"/>
     </w:rPr>
   </w:style>

</xml_diff>